<commit_message>
Add SAP ASE semantic source adapter
Includes the prerequisite MS #44.1 searchable milestone index link repair.
</commit_message>
<xml_diff>
--- a/docs/milestones/MS-44/MS-44.docx
+++ b/docs/milestones/MS-44/MS-44.docx
@@ -140,7 +140,7 @@
               <w:rPr>
                 <w:rFonts w:ascii="Calibri" w:hAnsi="Calibri"/>
               </w:rPr>
-              <w:t>0.44.0</w:t>
+              <w:t>0.44.0, 0.44.1</w:t>
             </w:r>
           </w:p>
         </w:tc>
@@ -296,7 +296,7 @@
         <w:pStyle w:val="ListBullet"/>
       </w:pPr>
       <w:r>
-        <w:t>A customer-facing index with direct links to every format.</w:t>
+        <w:t>A responsive browser index with full-text search across milestone number, title, customer value, capability, boundary, release, and roadmap phase.</w:t>
       </w:r>
     </w:p>
     <w:p>
@@ -304,7 +304,23 @@
         <w:pStyle w:val="ListBullet"/>
       </w:pPr>
       <w:r>
-        <w:t>A deterministic generator and content-addressed artifact manifest.</w:t>
+        <w:t>Absolute GitHub links for Markdown and PDF plus direct-download links for Microsoft Word, including when the index is viewed outside GitHub.</w:t>
+      </w:r>
+    </w:p>
+    <w:p>
+      <w:pPr>
+        <w:pStyle w:val="ListBullet"/>
+      </w:pPr>
+      <w:r>
+        <w:t>GitHub Pages publication for the interactive milestone library.</w:t>
+      </w:r>
+    </w:p>
+    <w:p>
+      <w:pPr>
+        <w:pStyle w:val="ListBullet"/>
+      </w:pPr>
+      <w:r>
+        <w:t>A deterministic generator and content-addressed artifact manifest that also governs the Markdown and HTML indexes.</w:t>
       </w:r>
     </w:p>
     <w:p>
@@ -398,6 +414,14 @@
         <w:pStyle w:val="ListBullet"/>
       </w:pPr>
       <w:r>
+        <w:t>Search is performed locally in the browser over the published customer-readable milestone metadata; it is not a search of underlying receipts or customer source code.</w:t>
+      </w:r>
+    </w:p>
+    <w:p>
+      <w:pPr>
+        <w:pStyle w:val="ListBullet"/>
+      </w:pPr>
+      <w:r>
         <w:t>A customer-facing narrative does not override the underlying receipts, ledgers, gates, or explicit false claims.</w:t>
       </w:r>
     </w:p>
@@ -422,7 +446,7 @@
         <w:pStyle w:val="ListBullet"/>
       </w:pPr>
       <w:r>
-        <w:t>CHANGELOG.md release section(s): 0.44.0</w:t>
+        <w:t>CHANGELOG.md release section(s): 0.44.0, 0.44.1</w:t>
       </w:r>
     </w:p>
     <w:p>

</xml_diff>